<commit_message>
2.12: yakitlarin kutlece yanma isisi grafigi baski boyutunda
</commit_message>
<xml_diff>
--- a/Kim12-2-12-Karbon-Temelli-Enerji-Kaynaklari.docx
+++ b/Kim12-2-12-Karbon-Temelli-Enerji-Kaynaklari.docx
@@ -10458,7 +10458,7 @@
       <w:r>
         <w:drawing>
           <wp:inline distT="0" distB="0" distL="0" distR="0">
-            <wp:extent cx="4680000" cy="2757000"/>
+            <wp:extent cx="5038354" cy="2590805"/>
             <wp:docPr id="900006" name="Grafik 900006" descr="Bazı yakıtların kJ/g değerleri"/>
             <wp:cNvGraphicFramePr>
               <a:graphicFrameLocks noChangeAspect="1"/>
@@ -10479,7 +10479,7 @@
                   <pic:spPr>
                     <a:xfrm>
                       <a:off x="0" y="0"/>
-                      <a:ext cx="4680000" cy="2757000"/>
+                      <a:ext cx="5038354" cy="2590805"/>
                     </a:xfrm>
                     <a:prstGeom prst="rect">
                       <a:avLst/>

</xml_diff>

<commit_message>
Kim12-2-12-Karbon-Temelli-Enerji-Kaynaklari: gorsel alanlarina Shutter onizlemeleri yerlestirildi (2.3 bicimi)
</commit_message>
<xml_diff>
--- a/Kim12-2-12-Karbon-Temelli-Enerji-Kaynaklari.docx
+++ b/Kim12-2-12-Karbon-Temelli-Enerji-Kaynaklari.docx
@@ -39,99 +39,73 @@
         <w:t xml:space="preserve">Soğuk kış günlerinde bazı şehirlerimizin üzerinde gri bir hava tabakası oluşur ve hava kirliliği uyarıları yapılır (Görsel A). Aynı günlerde doğal gazla ısınan mahallelerde hava daha temizdir. Arabalarımızın deposuna benzin ya da motorin, ocaklarımıza doğal gaz ya da tüp gaz, bazı sobalara kömür koyarız (Görsel B). Bu yakıtların hepsi yanarken enerji açığa çıkarır; ancak çevreye etkileri birbirinden farklıdır. Peki kömür, petrol ürünleri, doğal gaz ve alkoller yandığında hangi ürünler oluşur? Aynı miktarda enerji elde etmek için hangi yakıt havaya daha az karbon dioksit verir? Bir yakıtın kimyasal yapısı açığa çıkardığı enerjiyi ve çevreye etkisini nasıl belirler? Bu soruların cevabını bir etkinlik yaparak keşfediniz. Analiz ve Keşif Atölyesi 2.12.’de çıkarım yapacaksınız: Yanma tepkimelerine ilişkin varsayımlarda bulunacak, kanıt kartlarındaki verilerden örüntüler listeleyecek, enerji kaynaklarını açığa çıkardıkları enerji ve emisyon ayak izi bakımından karşılaştıracak, önermeler sunacak ve önermelerinizi bilimsel verilerle değerlendireceksiniz. Alkollerin yanmasıyla açığa çıkan ısıyı karşılaştırmak için grubunuzla bir deney planlayacak, planınızı azim ve kararlılıkla uygulayacak ve grup içinde uyumlu çalışacaksınız. Önermelerinizi değerlendirirken çevreye ve canlılara duyarlı, çevresel temizliği önemseyen bir bakış açısı geliştirecek, diğer grupların önermelerine eleştirel ama saygılı yaklaşacaksınız.</w:t>
       </w:r>
     </w:p>
-    <w:tbl>
-      <w:tblPr>
-        <w:tblW w:w="9000" w:type="dxa"/>
+    <w:p>
+      <w:pPr>
         <w:jc w:val="center"/>
-        <w:tblBorders>
-          <w:top w:val="single" w:sz="8" w:space="0" w:color="7F7F7F"/>
-          <w:left w:val="single" w:sz="8" w:space="0" w:color="7F7F7F"/>
-          <w:bottom w:val="single" w:sz="8" w:space="0" w:color="7F7F7F"/>
-          <w:right w:val="single" w:sz="8" w:space="0" w:color="7F7F7F"/>
-        </w:tblBorders>
-      </w:tblPr>
-      <w:tblGrid>
-        <w:gridCol w:w="9000"/>
-      </w:tblGrid>
-      <w:tr>
-        <w:tc>
-          <w:tcPr>
-            <w:tcW w:w="9000" w:type="dxa"/>
-            <w:shd w:val="clear" w:color="auto" w:fill="EDEDED"/>
-          </w:tcPr>
-          <w:p>
-            <w:pPr>
-              <w:jc w:val="both"/>
-              <w:rPr>
-                <w:rFonts w:ascii="Times New Roman" w:hAnsi="Times New Roman" w:cs="Times New Roman"/>
-                <w:lang w:val="tr-TR"/>
-              </w:rPr>
-            </w:pPr>
-            <w:r>
-              <w:rPr>
-                <w:rFonts w:ascii="Times New Roman" w:hAnsi="Times New Roman" w:cs="Times New Roman"/>
-                <w:lang w:val="tr-TR"/>
-              </w:rPr>
-              <w:t xml:space="preserve">GÖRSEL ALANI (Shutterstock)</w:t>
-            </w:r>
-          </w:p>
-          <w:p>
-            <w:pPr>
-              <w:jc w:val="both"/>
-              <w:rPr>
-                <w:rFonts w:ascii="Times New Roman" w:hAnsi="Times New Roman" w:cs="Times New Roman"/>
-                <w:lang w:val="tr-TR"/>
-              </w:rPr>
-            </w:pPr>
-            <w:r>
-              <w:rPr>
-                <w:rFonts w:ascii="Times New Roman" w:hAnsi="Times New Roman" w:cs="Times New Roman"/>
-                <w:lang w:val="tr-TR"/>
-              </w:rPr>
-              <w:t xml:space="preserve">Tarif: Kış mevsiminde bir şehir manzarası; bacalardan yükselen duman ve şehrin üzerinde gri bir kirlilik tabakası.</w:t>
-            </w:r>
-          </w:p>
-          <w:p>
-            <w:pPr>
-              <w:jc w:val="both"/>
-              <w:rPr>
-                <w:rFonts w:ascii="Times New Roman" w:hAnsi="Times New Roman" w:cs="Times New Roman"/>
-                <w:lang w:val="tr-TR"/>
-              </w:rPr>
-            </w:pPr>
-            <w:r>
-              <w:rPr>
-                <w:rFonts w:ascii="Times New Roman" w:hAnsi="Times New Roman" w:cs="Times New Roman"/>
-                <w:lang w:val="tr-TR"/>
-              </w:rPr>
-              <w:t xml:space="preserve">Shutter ID: 2739220279 (fotoğraf) — Smoking chimney releasing smoke</w:t>
-            </w:r>
-          </w:p>
-        </w:tc>
-      </w:tr>
-    </w:tbl>
+      </w:pPr>
+      <w:r>
+        <w:drawing>
+          <wp:inline xmlns:a="http://schemas.openxmlformats.org/drawingml/2006/main" xmlns:pic="http://schemas.openxmlformats.org/drawingml/2006/picture">
+            <wp:extent cx="3085714" cy="2520000"/>
+            <wp:docPr id="900016" name="Picture 900016"/>
+            <wp:cNvGraphicFramePr>
+              <a:graphicFrameLocks noChangeAspect="1"/>
+            </wp:cNvGraphicFramePr>
+            <a:graphic>
+              <a:graphicData uri="http://schemas.openxmlformats.org/drawingml/2006/picture">
+                <pic:pic>
+                  <pic:nvPicPr>
+                    <pic:cNvPr id="0" name="2739220279_d.jpg"/>
+                    <pic:cNvPicPr/>
+                  </pic:nvPicPr>
+                  <pic:blipFill>
+                    <a:blip r:embed="rId11"/>
+                    <a:stretch>
+                      <a:fillRect/>
+                    </a:stretch>
+                  </pic:blipFill>
+                  <pic:spPr>
+                    <a:xfrm>
+                      <a:off x="0" y="0"/>
+                      <a:ext cx="3085714" cy="2520000"/>
+                    </a:xfrm>
+                    <a:prstGeom prst="rect"/>
+                  </pic:spPr>
+                </pic:pic>
+              </a:graphicData>
+            </a:graphic>
+          </wp:inline>
+        </w:drawing>
+      </w:r>
+    </w:p>
     <w:p>
       <w:pPr>
-        <w:jc w:val="both"/>
-        <w:rPr>
-          <w:rFonts w:ascii="Times New Roman" w:hAnsi="Times New Roman" w:cs="Times New Roman"/>
-          <w:lang w:val="tr-TR"/>
-        </w:rPr>
-      </w:pPr>
-    </w:p>
-    <w:p>
-      <w:pPr>
         <w:jc w:val="center"/>
-        <w:rPr>
-          <w:rFonts w:ascii="Times New Roman" w:hAnsi="Times New Roman" w:cs="Times New Roman"/>
-          <w:lang w:val="tr-TR"/>
-        </w:rPr>
       </w:pPr>
       <w:r>
         <w:rPr>
           <w:rFonts w:ascii="Times New Roman" w:hAnsi="Times New Roman" w:cs="Times New Roman"/>
           <w:b/>
           <w:bCs/>
+          <w:highlight w:val="yellow"/>
+          <w:lang w:val="tr-TR"/>
+        </w:rPr>
+        <w:t xml:space="preserve">Shutter id: 2739220279</w:t>
+      </w:r>
+    </w:p>
+    <w:p>
+      <w:pPr>
+        <w:jc w:val="center"/>
+        <w:rPr>
+          <w:rFonts w:ascii="Times New Roman" w:hAnsi="Times New Roman" w:cs="Times New Roman"/>
+          <w:lang w:val="tr-TR"/>
+        </w:rPr>
+      </w:pPr>
+      <w:r>
+        <w:rPr>
+          <w:rFonts w:ascii="Times New Roman" w:hAnsi="Times New Roman" w:cs="Times New Roman"/>
+          <w:b/>
+          <w:bCs/>
           <w:lang w:val="tr-TR"/>
         </w:rPr>
         <w:t xml:space="preserve">Görsel A:</w:t>
@@ -144,85 +118,59 @@
         <w:t xml:space="preserve"> Kışın şehirde hava kirliliği</w:t>
       </w:r>
     </w:p>
-    <w:tbl>
-      <w:tblPr>
-        <w:tblW w:w="9000" w:type="dxa"/>
+    <w:p>
+      <w:pPr>
         <w:jc w:val="center"/>
-        <w:tblBorders>
-          <w:top w:val="single" w:sz="8" w:space="0" w:color="7F7F7F"/>
-          <w:left w:val="single" w:sz="8" w:space="0" w:color="7F7F7F"/>
-          <w:bottom w:val="single" w:sz="8" w:space="0" w:color="7F7F7F"/>
-          <w:right w:val="single" w:sz="8" w:space="0" w:color="7F7F7F"/>
-        </w:tblBorders>
-      </w:tblPr>
-      <w:tblGrid>
-        <w:gridCol w:w="9000"/>
-      </w:tblGrid>
-      <w:tr>
-        <w:tc>
-          <w:tcPr>
-            <w:tcW w:w="9000" w:type="dxa"/>
-            <w:shd w:val="clear" w:color="auto" w:fill="EDEDED"/>
-          </w:tcPr>
-          <w:p>
-            <w:pPr>
-              <w:jc w:val="both"/>
-              <w:rPr>
-                <w:rFonts w:ascii="Times New Roman" w:hAnsi="Times New Roman" w:cs="Times New Roman"/>
-                <w:lang w:val="tr-TR"/>
-              </w:rPr>
-            </w:pPr>
-            <w:r>
-              <w:rPr>
-                <w:rFonts w:ascii="Times New Roman" w:hAnsi="Times New Roman" w:cs="Times New Roman"/>
-                <w:lang w:val="tr-TR"/>
-              </w:rPr>
-              <w:t xml:space="preserve">GÖRSEL ALANI (Shutterstock)</w:t>
-            </w:r>
-          </w:p>
-          <w:p>
-            <w:pPr>
-              <w:jc w:val="both"/>
-              <w:rPr>
-                <w:rFonts w:ascii="Times New Roman" w:hAnsi="Times New Roman" w:cs="Times New Roman"/>
-                <w:lang w:val="tr-TR"/>
-              </w:rPr>
-            </w:pPr>
-            <w:r>
-              <w:rPr>
-                <w:rFonts w:ascii="Times New Roman" w:hAnsi="Times New Roman" w:cs="Times New Roman"/>
-                <w:lang w:val="tr-TR"/>
-              </w:rPr>
-              <w:t xml:space="preserve">Tarif: Yan yana üç küçük görsel: mavi alevle yanan doğal gaz ocağı, bir kova kömür, akaryakıt pompası tabancası (marka ve logo görünmesin).</w:t>
-            </w:r>
-          </w:p>
-          <w:p>
-            <w:pPr>
-              <w:jc w:val="both"/>
-              <w:rPr>
-                <w:rFonts w:ascii="Times New Roman" w:hAnsi="Times New Roman" w:cs="Times New Roman"/>
-                <w:lang w:val="tr-TR"/>
-              </w:rPr>
-            </w:pPr>
-            <w:r>
-              <w:rPr>
-                <w:rFonts w:ascii="Times New Roman" w:hAnsi="Times New Roman" w:cs="Times New Roman"/>
-                <w:lang w:val="tr-TR"/>
-              </w:rPr>
-              <w:t xml:space="preserve">Shutter ID: 1099246217 (fotoğraf) — Burning blue gas on a gas stove</w:t>
-            </w:r>
-          </w:p>
-        </w:tc>
-      </w:tr>
-    </w:tbl>
+      </w:pPr>
+      <w:r>
+        <w:drawing>
+          <wp:inline xmlns:a="http://schemas.openxmlformats.org/drawingml/2006/main" xmlns:pic="http://schemas.openxmlformats.org/drawingml/2006/picture">
+            <wp:extent cx="3439490" cy="2520000"/>
+            <wp:docPr id="900017" name="Picture 900017"/>
+            <wp:cNvGraphicFramePr>
+              <a:graphicFrameLocks noChangeAspect="1"/>
+            </wp:cNvGraphicFramePr>
+            <a:graphic>
+              <a:graphicData uri="http://schemas.openxmlformats.org/drawingml/2006/picture">
+                <pic:pic>
+                  <pic:nvPicPr>
+                    <pic:cNvPr id="0" name="1099246217_d.jpg"/>
+                    <pic:cNvPicPr/>
+                  </pic:nvPicPr>
+                  <pic:blipFill>
+                    <a:blip r:embed="rId12"/>
+                    <a:stretch>
+                      <a:fillRect/>
+                    </a:stretch>
+                  </pic:blipFill>
+                  <pic:spPr>
+                    <a:xfrm>
+                      <a:off x="0" y="0"/>
+                      <a:ext cx="3439490" cy="2520000"/>
+                    </a:xfrm>
+                    <a:prstGeom prst="rect"/>
+                  </pic:spPr>
+                </pic:pic>
+              </a:graphicData>
+            </a:graphic>
+          </wp:inline>
+        </w:drawing>
+      </w:r>
+    </w:p>
     <w:p>
       <w:pPr>
-        <w:jc w:val="both"/>
-        <w:rPr>
-          <w:rFonts w:ascii="Times New Roman" w:hAnsi="Times New Roman" w:cs="Times New Roman"/>
-          <w:lang w:val="tr-TR"/>
-        </w:rPr>
-      </w:pPr>
+        <w:jc w:val="center"/>
+      </w:pPr>
+      <w:r>
+        <w:rPr>
+          <w:rFonts w:ascii="Times New Roman" w:hAnsi="Times New Roman" w:cs="Times New Roman"/>
+          <w:b/>
+          <w:bCs/>
+          <w:highlight w:val="yellow"/>
+          <w:lang w:val="tr-TR"/>
+        </w:rPr>
+        <w:t xml:space="preserve">Shutter id: 1099246217</w:t>
+      </w:r>
     </w:p>
     <w:p>
       <w:pPr>

</xml_diff>